<commit_message>
Update - fix Link
</commit_message>
<xml_diff>
--- a/FinalAssessment/FinalAssessment-Questions.docx
+++ b/FinalAssessment/FinalAssessment-Questions.docx
@@ -18,18 +18,7 @@
           <w:szCs w:val="48"/>
           <w:highlight w:val="lightGray"/>
         </w:rPr>
-        <w:t>Final A</w:t>
-      </w:r>
-      <w:bookmarkStart w:id="0" w:name="_GoBack"/>
-      <w:bookmarkEnd w:id="0"/>
-      <w:r>
-        <w:rPr>
-          <w:b/>
-          <w:sz w:val="48"/>
-          <w:szCs w:val="48"/>
-          <w:highlight w:val="lightGray"/>
-        </w:rPr>
-        <w:t xml:space="preserve">ssessment - </w:t>
+        <w:t xml:space="preserve">Final Assessment - </w:t>
       </w:r>
       <w:r>
         <w:rPr>
@@ -1216,6 +1205,7 @@
     <w:p>
       <w:pPr>
         <w:rPr>
+          <w:rStyle w:val="Hyperlink"/>
           <w:b/>
           <w:sz w:val="32"/>
           <w:szCs w:val="32"/>
@@ -1229,13 +1219,35 @@
             <w:sz w:val="32"/>
             <w:szCs w:val="32"/>
           </w:rPr>
-          <w:t>https://github.com/ShahzadSarwar10/FULL-STACK-B-8-Wed-Thru-Fri/tree/main/FinalAssessment/SpaceX%20Missions%2C%202006-Present</w:t>
+          <w:t>https://github.com/ShahzadSarwar10/FULL-STACK-B-8-Wed-Thru-Fri/tree/main/FinalAssessment/SpaceX%20SPCX%20Stock%20Price%2030m%20Interval</w:t>
         </w:r>
       </w:hyperlink>
     </w:p>
     <w:p>
       <w:pPr>
         <w:rPr>
+          <w:rStyle w:val="Hyperlink"/>
+          <w:b/>
+          <w:sz w:val="32"/>
+          <w:szCs w:val="32"/>
+        </w:rPr>
+      </w:pPr>
+    </w:p>
+    <w:p>
+      <w:pPr>
+        <w:rPr>
+          <w:rStyle w:val="Hyperlink"/>
+          <w:b/>
+          <w:sz w:val="32"/>
+          <w:szCs w:val="32"/>
+        </w:rPr>
+      </w:pPr>
+      <w:bookmarkStart w:id="0" w:name="_GoBack"/>
+      <w:bookmarkEnd w:id="0"/>
+    </w:p>
+    <w:p>
+      <w:pPr>
+        <w:rPr>
           <w:b/>
           <w:sz w:val="32"/>
           <w:szCs w:val="32"/>
@@ -1249,6 +1261,7 @@
           <w:szCs w:val="32"/>
           <w:highlight w:val="lightGray"/>
         </w:rPr>
+        <w:lastRenderedPageBreak/>
         <w:t>Dataset 4</w:t>
       </w:r>
       <w:proofErr w:type="gramStart"/>
@@ -1748,31 +1761,7 @@
           <w:sz w:val="32"/>
           <w:szCs w:val="32"/>
         </w:rPr>
-        <w:t xml:space="preserve">Next, </w:t>
-      </w:r>
-      <w:r>
-        <w:rPr>
-          <w:b/>
-          <w:sz w:val="32"/>
-          <w:szCs w:val="32"/>
-        </w:rPr>
-        <w:t xml:space="preserve">Select one of the above </w:t>
-      </w:r>
-      <w:r>
-        <w:rPr>
-          <w:b/>
-          <w:sz w:val="32"/>
-          <w:szCs w:val="32"/>
-        </w:rPr>
-        <w:t xml:space="preserve">different </w:t>
-      </w:r>
-      <w:r>
-        <w:rPr>
-          <w:b/>
-          <w:sz w:val="32"/>
-          <w:szCs w:val="32"/>
-        </w:rPr>
-        <w:t>dataset and apply.</w:t>
+        <w:t>Next, Select one of the above different dataset and apply.</w:t>
       </w:r>
     </w:p>
     <w:p>
@@ -2487,23 +2476,7 @@
           <w:sz w:val="32"/>
           <w:szCs w:val="32"/>
         </w:rPr>
-        <w:t>Question/Task -</w:t>
-      </w:r>
-      <w:r>
-        <w:rPr>
-          <w:b/>
-          <w:sz w:val="32"/>
-          <w:szCs w:val="32"/>
-        </w:rPr>
-        <w:t xml:space="preserve"> 3</w:t>
-      </w:r>
-      <w:r>
-        <w:rPr>
-          <w:b/>
-          <w:sz w:val="32"/>
-          <w:szCs w:val="32"/>
-        </w:rPr>
-        <w:t>:</w:t>
+        <w:t>Question/Task - 3:</w:t>
       </w:r>
     </w:p>
     <w:p>
@@ -2558,15 +2531,7 @@
           <w:sz w:val="32"/>
           <w:szCs w:val="32"/>
         </w:rPr>
-        <w:t>/Task</w:t>
-      </w:r>
-      <w:r>
-        <w:rPr>
-          <w:b/>
-          <w:sz w:val="32"/>
-          <w:szCs w:val="32"/>
-        </w:rPr>
-        <w:t xml:space="preserve"> 4</w:t>
+        <w:t>/Task 4</w:t>
       </w:r>
       <w:r>
         <w:rPr>
@@ -10521,7 +10486,7 @@
 </file>
 
 <file path=customXml/itemProps1.xml><?xml version="1.0" encoding="utf-8"?>
-<ds:datastoreItem xmlns:ds="http://schemas.openxmlformats.org/officeDocument/2006/customXml" ds:itemID="{B97A1024-4F7A-4386-960A-7524BA578C62}">
+<ds:datastoreItem xmlns:ds="http://schemas.openxmlformats.org/officeDocument/2006/customXml" ds:itemID="{C2DE0A21-1865-4A21-BED5-6B30EC680EF4}">
   <ds:schemaRefs>
     <ds:schemaRef ds:uri="http://schemas.openxmlformats.org/officeDocument/2006/bibliography"/>
   </ds:schemaRefs>

</xml_diff>